<commit_message>
docs: Add algorithm docs and update datamodel docs
Added new documentation files for the algorithm and updated both DOCX and PDF versions of the datamodel documentation.
</commit_message>
<xml_diff>
--- a/Documents/Datamodel Documentation/Datamodel Documentation.docx
+++ b/Documents/Datamodel Documentation/Datamodel Documentation.docx
@@ -90,12 +90,12 @@
             <wp:extent cx="4044413" cy="2752725"/>
             <wp:effectExtent b="0" l="0" r="0" t="0"/>
             <wp:wrapNone/>
-            <wp:docPr id="21" name="image4.png"/>
+            <wp:docPr id="21" name="image3.png"/>
             <a:graphic>
               <a:graphicData uri="http://schemas.openxmlformats.org/drawingml/2006/picture">
                 <pic:pic>
                   <pic:nvPicPr>
-                    <pic:cNvPr id="0" name="image4.png"/>
+                    <pic:cNvPr id="0" name="image3.png"/>
                     <pic:cNvPicPr preferRelativeResize="0"/>
                   </pic:nvPicPr>
                   <pic:blipFill>
@@ -193,12 +193,12 @@
             <wp:extent cx="2067038" cy="2067038"/>
             <wp:effectExtent b="0" l="0" r="0" t="0"/>
             <wp:wrapSquare wrapText="bothSides" distB="0" distT="0" distL="0" distR="0"/>
-            <wp:docPr id="20" name="image5.png"/>
+            <wp:docPr id="20" name="image4.png"/>
             <a:graphic>
               <a:graphicData uri="http://schemas.openxmlformats.org/drawingml/2006/picture">
                 <pic:pic>
                   <pic:nvPicPr>
-                    <pic:cNvPr id="0" name="image5.png"/>
+                    <pic:cNvPr id="0" name="image4.png"/>
                     <pic:cNvPicPr preferRelativeResize="0"/>
                   </pic:nvPicPr>
                   <pic:blipFill>
@@ -270,7 +270,7 @@
     </w:p>
     <w:sdt>
       <w:sdtPr>
-        <w:id w:val="-204379541"/>
+        <w:id w:val="1480719215"/>
         <w:docPartObj>
           <w:docPartGallery w:val="Table of Contents"/>
           <w:docPartUnique w:val="1"/>
@@ -392,7 +392,9 @@
               <w:i w:val="0"/>
               <w:smallCaps w:val="0"/>
               <w:strike w:val="0"/>
-              <w:color w:val="2e7d32"/>
+              <w:color w:val="000000"/>
+              <w:sz w:val="22"/>
+              <w:szCs w:val="22"/>
               <w:u w:val="none"/>
               <w:shd w:fill="auto" w:val="clear"/>
               <w:vertAlign w:val="baseline"/>
@@ -401,12 +403,14 @@
           <w:hyperlink w:anchor="_heading=h.yi3vdmma86m6">
             <w:r>
               <w:rPr>
-                <w:rFonts w:ascii="Arial" w:cs="Arial" w:eastAsia="Arial" w:hAnsi="Arial"/>
+                <w:rFonts w:ascii="Cambria" w:cs="Cambria" w:eastAsia="Cambria" w:hAnsi="Cambria"/>
                 <w:b w:val="0"/>
                 <w:i w:val="0"/>
                 <w:smallCaps w:val="0"/>
                 <w:strike w:val="0"/>
                 <w:color w:val="2e7d32"/>
+                <w:sz w:val="22"/>
+                <w:szCs w:val="22"/>
                 <w:u w:val="none"/>
                 <w:shd w:fill="auto" w:val="clear"/>
                 <w:vertAlign w:val="baseline"/>
@@ -437,7 +441,9 @@
               <w:i w:val="0"/>
               <w:smallCaps w:val="0"/>
               <w:strike w:val="0"/>
-              <w:color w:val="2e7d32"/>
+              <w:color w:val="000000"/>
+              <w:sz w:val="22"/>
+              <w:szCs w:val="22"/>
               <w:u w:val="none"/>
               <w:shd w:fill="auto" w:val="clear"/>
               <w:vertAlign w:val="baseline"/>
@@ -446,12 +452,14 @@
           <w:hyperlink w:anchor="_heading=h.uim0dythawlr">
             <w:r>
               <w:rPr>
-                <w:rFonts w:ascii="Arial" w:cs="Arial" w:eastAsia="Arial" w:hAnsi="Arial"/>
+                <w:rFonts w:ascii="Cambria" w:cs="Cambria" w:eastAsia="Cambria" w:hAnsi="Cambria"/>
                 <w:b w:val="0"/>
                 <w:i w:val="0"/>
                 <w:smallCaps w:val="0"/>
                 <w:strike w:val="0"/>
                 <w:color w:val="2e7d32"/>
+                <w:sz w:val="22"/>
+                <w:szCs w:val="22"/>
                 <w:u w:val="none"/>
                 <w:shd w:fill="auto" w:val="clear"/>
                 <w:vertAlign w:val="baseline"/>
@@ -493,29 +501,12 @@
           <w:hyperlink w:anchor="_heading=h.ivakieiu3t11">
             <w:r>
               <w:rPr>
-                <w:rFonts w:ascii="Arial" w:cs="Arial" w:eastAsia="Arial" w:hAnsi="Arial"/>
+                <w:rFonts w:ascii="Cambria" w:cs="Cambria" w:eastAsia="Cambria" w:hAnsi="Cambria"/>
                 <w:b w:val="0"/>
                 <w:i w:val="0"/>
                 <w:smallCaps w:val="0"/>
                 <w:strike w:val="0"/>
                 <w:color w:val="2e7d32"/>
-                <w:u w:val="none"/>
-                <w:shd w:fill="auto" w:val="clear"/>
-                <w:vertAlign w:val="baseline"/>
-                <w:rtl w:val="0"/>
-              </w:rPr>
-              <w:t xml:space="preserve">1.3 A modell logikai felépítése</w:t>
-            </w:r>
-          </w:hyperlink>
-          <w:hyperlink w:anchor="_heading=h.ivakieiu3t11">
-            <w:r>
-              <w:rPr>
-                <w:rFonts w:ascii="Arial" w:cs="Arial" w:eastAsia="Arial" w:hAnsi="Arial"/>
-                <w:b w:val="0"/>
-                <w:i w:val="0"/>
-                <w:smallCaps w:val="0"/>
-                <w:strike w:val="0"/>
-                <w:color w:val="000000"/>
                 <w:sz w:val="22"/>
                 <w:szCs w:val="22"/>
                 <w:u w:val="none"/>
@@ -523,6 +514,7 @@
                 <w:vertAlign w:val="baseline"/>
                 <w:rtl w:val="0"/>
               </w:rPr>
+              <w:t xml:space="preserve">1.3 A modell logikai felépítése</w:t>
               <w:tab/>
               <w:t xml:space="preserve">2</w:t>
             </w:r>
@@ -640,7 +632,6 @@
             <w:ind w:left="720" w:firstLine="0"/>
             <w:rPr>
               <w:rFonts w:ascii="Arial" w:cs="Arial" w:eastAsia="Arial" w:hAnsi="Arial"/>
-              <w:b w:val="0"/>
               <w:i w:val="0"/>
               <w:smallCaps w:val="0"/>
               <w:strike w:val="0"/>
@@ -655,8 +646,6 @@
           <w:hyperlink w:anchor="_heading=">
             <w:r>
               <w:rPr>
-                <w:rFonts w:ascii="Arial" w:cs="Arial" w:eastAsia="Arial" w:hAnsi="Arial"/>
-                <w:b w:val="0"/>
                 <w:i w:val="0"/>
                 <w:smallCaps w:val="0"/>
                 <w:strike w:val="0"/>
@@ -689,7 +678,6 @@
             <w:ind w:left="720" w:firstLine="0"/>
             <w:rPr>
               <w:rFonts w:ascii="Arial" w:cs="Arial" w:eastAsia="Arial" w:hAnsi="Arial"/>
-              <w:b w:val="0"/>
               <w:i w:val="0"/>
               <w:smallCaps w:val="0"/>
               <w:strike w:val="0"/>
@@ -704,8 +692,6 @@
           <w:hyperlink w:anchor="_heading=">
             <w:r>
               <w:rPr>
-                <w:rFonts w:ascii="Arial" w:cs="Arial" w:eastAsia="Arial" w:hAnsi="Arial"/>
-                <w:b w:val="0"/>
                 <w:i w:val="0"/>
                 <w:smallCaps w:val="0"/>
                 <w:strike w:val="0"/>
@@ -717,56 +703,7 @@
                 <w:vertAlign w:val="baseline"/>
                 <w:rtl w:val="0"/>
               </w:rPr>
-              <w:t xml:space="preserve">2.3 Csatolmányok(attachments)</w:t>
-              <w:tab/>
-              <w:t xml:space="preserve">3</w:t>
-            </w:r>
-          </w:hyperlink>
-          <w:r>
-            <w:rPr>
-              <w:rtl w:val="0"/>
-            </w:rPr>
-          </w:r>
-        </w:p>
-        <w:p>
-          <w:pPr>
-            <w:widowControl w:val="0"/>
-            <w:tabs>
-              <w:tab w:val="right" w:leader="dot" w:pos="12000"/>
-            </w:tabs>
-            <w:spacing w:after="0" w:before="60" w:line="240" w:lineRule="auto"/>
-            <w:ind w:left="720" w:firstLine="0"/>
-            <w:rPr>
-              <w:rFonts w:ascii="Arial" w:cs="Arial" w:eastAsia="Arial" w:hAnsi="Arial"/>
-              <w:b w:val="0"/>
-              <w:i w:val="0"/>
-              <w:smallCaps w:val="0"/>
-              <w:strike w:val="0"/>
-              <w:color w:val="2e7d32"/>
-              <w:sz w:val="22"/>
-              <w:szCs w:val="22"/>
-              <w:u w:val="none"/>
-              <w:shd w:fill="auto" w:val="clear"/>
-              <w:vertAlign w:val="baseline"/>
-            </w:rPr>
-          </w:pPr>
-          <w:hyperlink w:anchor="_heading=">
-            <w:r>
-              <w:rPr>
-                <w:rFonts w:ascii="Arial" w:cs="Arial" w:eastAsia="Arial" w:hAnsi="Arial"/>
-                <w:b w:val="0"/>
-                <w:i w:val="0"/>
-                <w:smallCaps w:val="0"/>
-                <w:strike w:val="0"/>
-                <w:color w:val="2e7d32"/>
-                <w:sz w:val="22"/>
-                <w:szCs w:val="22"/>
-                <w:u w:val="none"/>
-                <w:shd w:fill="auto" w:val="clear"/>
-                <w:vertAlign w:val="baseline"/>
-                <w:rtl w:val="0"/>
-              </w:rPr>
-              <w:t xml:space="preserve">2.4 Kurzusok(courses)</w:t>
+              <w:t xml:space="preserve">2.3 Csatolmányok (attachments)</w:t>
               <w:tab/>
               <w:t xml:space="preserve">4</w:t>
             </w:r>
@@ -787,11 +724,10 @@
             <w:ind w:left="720" w:firstLine="0"/>
             <w:rPr>
               <w:rFonts w:ascii="Arial" w:cs="Arial" w:eastAsia="Arial" w:hAnsi="Arial"/>
-              <w:b w:val="0"/>
               <w:i w:val="0"/>
               <w:smallCaps w:val="0"/>
               <w:strike w:val="0"/>
-              <w:color w:val="000000"/>
+              <w:color w:val="2e7d32"/>
               <w:sz w:val="22"/>
               <w:szCs w:val="22"/>
               <w:u w:val="none"/>
@@ -802,8 +738,6 @@
           <w:hyperlink w:anchor="_heading=">
             <w:r>
               <w:rPr>
-                <w:rFonts w:ascii="Arial" w:cs="Arial" w:eastAsia="Arial" w:hAnsi="Arial"/>
-                <w:b w:val="0"/>
                 <w:i w:val="0"/>
                 <w:smallCaps w:val="0"/>
                 <w:strike w:val="0"/>
@@ -815,18 +749,45 @@
                 <w:vertAlign w:val="baseline"/>
                 <w:rtl w:val="0"/>
               </w:rPr>
-              <w:t xml:space="preserve">2.5 Beadások(submissions)</w:t>
+              <w:t xml:space="preserve">2.4 Kurzusok (courses)</w:t>
+              <w:tab/>
+              <w:t xml:space="preserve">4</w:t>
             </w:r>
           </w:hyperlink>
+          <w:r>
+            <w:rPr>
+              <w:rtl w:val="0"/>
+            </w:rPr>
+          </w:r>
+        </w:p>
+        <w:p>
+          <w:pPr>
+            <w:widowControl w:val="0"/>
+            <w:tabs>
+              <w:tab w:val="right" w:leader="dot" w:pos="12000"/>
+            </w:tabs>
+            <w:spacing w:after="0" w:before="60" w:line="240" w:lineRule="auto"/>
+            <w:ind w:left="720" w:firstLine="0"/>
+            <w:rPr>
+              <w:rFonts w:ascii="Arial" w:cs="Arial" w:eastAsia="Arial" w:hAnsi="Arial"/>
+              <w:i w:val="0"/>
+              <w:smallCaps w:val="0"/>
+              <w:strike w:val="0"/>
+              <w:color w:val="2e7d32"/>
+              <w:sz w:val="22"/>
+              <w:szCs w:val="22"/>
+              <w:u w:val="none"/>
+              <w:shd w:fill="auto" w:val="clear"/>
+              <w:vertAlign w:val="baseline"/>
+            </w:rPr>
+          </w:pPr>
           <w:hyperlink w:anchor="_heading=">
             <w:r>
               <w:rPr>
-                <w:rFonts w:ascii="Arial" w:cs="Arial" w:eastAsia="Arial" w:hAnsi="Arial"/>
-                <w:b w:val="0"/>
                 <w:i w:val="0"/>
                 <w:smallCaps w:val="0"/>
                 <w:strike w:val="0"/>
-                <w:color w:val="000000"/>
+                <w:color w:val="2e7d32"/>
                 <w:sz w:val="22"/>
                 <w:szCs w:val="22"/>
                 <w:u w:val="none"/>
@@ -834,6 +795,7 @@
                 <w:vertAlign w:val="baseline"/>
                 <w:rtl w:val="0"/>
               </w:rPr>
+              <w:t xml:space="preserve">2.5 Beadások (submissions)</w:t>
               <w:tab/>
               <w:t xml:space="preserve">4</w:t>
             </w:r>
@@ -868,26 +830,7 @@
           <w:hyperlink w:anchor="_heading=">
             <w:r>
               <w:rPr>
-                <w:rFonts w:ascii="Arial" w:cs="Arial" w:eastAsia="Arial" w:hAnsi="Arial"/>
-                <w:b w:val="1"/>
-                <w:i w:val="0"/>
-                <w:smallCaps w:val="0"/>
-                <w:strike w:val="0"/>
-                <w:color w:val="000000"/>
-                <w:sz w:val="22"/>
-                <w:szCs w:val="22"/>
-                <w:u w:val="none"/>
-                <w:shd w:fill="auto" w:val="clear"/>
-                <w:vertAlign w:val="baseline"/>
-                <w:rtl w:val="0"/>
-              </w:rPr>
-              <w:t xml:space="preserve">3. </w:t>
-            </w:r>
-          </w:hyperlink>
-          <w:hyperlink w:anchor="_heading=">
-            <w:r>
-              <w:rPr>
-                <w:rFonts w:ascii="Arial" w:cs="Arial" w:eastAsia="Arial" w:hAnsi="Arial"/>
+                <w:rFonts w:ascii="Cambria" w:cs="Cambria" w:eastAsia="Cambria" w:hAnsi="Cambria"/>
                 <w:b w:val="1"/>
                 <w:i w:val="0"/>
                 <w:smallCaps w:val="0"/>
@@ -900,25 +843,7 @@
                 <w:vertAlign w:val="baseline"/>
                 <w:rtl w:val="0"/>
               </w:rPr>
-              <w:t xml:space="preserve">Modell altáblái</w:t>
-            </w:r>
-          </w:hyperlink>
-          <w:hyperlink w:anchor="_heading=">
-            <w:r>
-              <w:rPr>
-                <w:rFonts w:ascii="Arial" w:cs="Arial" w:eastAsia="Arial" w:hAnsi="Arial"/>
-                <w:b w:val="1"/>
-                <w:i w:val="0"/>
-                <w:smallCaps w:val="0"/>
-                <w:strike w:val="0"/>
-                <w:color w:val="000000"/>
-                <w:sz w:val="22"/>
-                <w:szCs w:val="22"/>
-                <w:u w:val="none"/>
-                <w:shd w:fill="auto" w:val="clear"/>
-                <w:vertAlign w:val="baseline"/>
-                <w:rtl w:val="0"/>
-              </w:rPr>
+              <w:t xml:space="preserve">3. Modell altáblái</w:t>
               <w:tab/>
               <w:t xml:space="preserve">5</w:t>
             </w:r>
@@ -939,7 +864,6 @@
             <w:ind w:left="720" w:firstLine="0"/>
             <w:rPr>
               <w:rFonts w:ascii="Arial" w:cs="Arial" w:eastAsia="Arial" w:hAnsi="Arial"/>
-              <w:b w:val="0"/>
               <w:i w:val="0"/>
               <w:smallCaps w:val="0"/>
               <w:strike w:val="0"/>
@@ -954,8 +878,6 @@
           <w:hyperlink w:anchor="_heading=">
             <w:r>
               <w:rPr>
-                <w:rFonts w:ascii="Arial" w:cs="Arial" w:eastAsia="Arial" w:hAnsi="Arial"/>
-                <w:b w:val="0"/>
                 <w:i w:val="0"/>
                 <w:smallCaps w:val="0"/>
                 <w:strike w:val="0"/>
@@ -988,7 +910,6 @@
             <w:ind w:left="720" w:firstLine="0"/>
             <w:rPr>
               <w:rFonts w:ascii="Arial" w:cs="Arial" w:eastAsia="Arial" w:hAnsi="Arial"/>
-              <w:b w:val="0"/>
               <w:i w:val="0"/>
               <w:smallCaps w:val="0"/>
               <w:strike w:val="0"/>
@@ -1003,8 +924,6 @@
           <w:hyperlink w:anchor="_heading=">
             <w:r>
               <w:rPr>
-                <w:rFonts w:ascii="Arial" w:cs="Arial" w:eastAsia="Arial" w:hAnsi="Arial"/>
-                <w:b w:val="0"/>
                 <w:i w:val="0"/>
                 <w:smallCaps w:val="0"/>
                 <w:strike w:val="0"/>
@@ -1037,7 +956,6 @@
             <w:ind w:left="720" w:firstLine="0"/>
             <w:rPr>
               <w:rFonts w:ascii="Arial" w:cs="Arial" w:eastAsia="Arial" w:hAnsi="Arial"/>
-              <w:b w:val="0"/>
               <w:i w:val="0"/>
               <w:smallCaps w:val="0"/>
               <w:strike w:val="0"/>
@@ -1052,8 +970,6 @@
           <w:hyperlink w:anchor="_heading=">
             <w:r>
               <w:rPr>
-                <w:rFonts w:ascii="Arial" w:cs="Arial" w:eastAsia="Arial" w:hAnsi="Arial"/>
-                <w:b w:val="0"/>
                 <w:i w:val="0"/>
                 <w:smallCaps w:val="0"/>
                 <w:strike w:val="0"/>
@@ -1086,7 +1002,6 @@
             <w:ind w:left="720" w:firstLine="0"/>
             <w:rPr>
               <w:rFonts w:ascii="Arial" w:cs="Arial" w:eastAsia="Arial" w:hAnsi="Arial"/>
-              <w:b w:val="0"/>
               <w:i w:val="0"/>
               <w:smallCaps w:val="0"/>
               <w:strike w:val="0"/>
@@ -1101,8 +1016,6 @@
           <w:hyperlink w:anchor="_heading=">
             <w:r>
               <w:rPr>
-                <w:rFonts w:ascii="Arial" w:cs="Arial" w:eastAsia="Arial" w:hAnsi="Arial"/>
-                <w:b w:val="0"/>
                 <w:i w:val="0"/>
                 <w:smallCaps w:val="0"/>
                 <w:strike w:val="0"/>
@@ -1135,7 +1048,6 @@
             <w:ind w:left="720" w:firstLine="0"/>
             <w:rPr>
               <w:rFonts w:ascii="Arial" w:cs="Arial" w:eastAsia="Arial" w:hAnsi="Arial"/>
-              <w:b w:val="0"/>
               <w:i w:val="0"/>
               <w:smallCaps w:val="0"/>
               <w:strike w:val="0"/>
@@ -1150,8 +1062,6 @@
           <w:hyperlink w:anchor="_heading=">
             <w:r>
               <w:rPr>
-                <w:rFonts w:ascii="Arial" w:cs="Arial" w:eastAsia="Arial" w:hAnsi="Arial"/>
-                <w:b w:val="0"/>
                 <w:i w:val="0"/>
                 <w:smallCaps w:val="0"/>
                 <w:strike w:val="0"/>
@@ -1163,7 +1073,7 @@
                 <w:vertAlign w:val="baseline"/>
                 <w:rtl w:val="0"/>
               </w:rPr>
-              <w:t xml:space="preserve">3.5 Poszt üzenetek(post_messages)</w:t>
+              <w:t xml:space="preserve">3.5 Poszt üzenetek (post_messages)</w:t>
               <w:tab/>
               <w:t xml:space="preserve">6</w:t>
             </w:r>
@@ -1184,7 +1094,6 @@
             <w:ind w:left="720" w:firstLine="0"/>
             <w:rPr>
               <w:rFonts w:ascii="Arial" w:cs="Arial" w:eastAsia="Arial" w:hAnsi="Arial"/>
-              <w:b w:val="0"/>
               <w:i w:val="0"/>
               <w:smallCaps w:val="0"/>
               <w:strike w:val="0"/>
@@ -1199,8 +1108,6 @@
           <w:hyperlink w:anchor="_heading=">
             <w:r>
               <w:rPr>
-                <w:rFonts w:ascii="Arial" w:cs="Arial" w:eastAsia="Arial" w:hAnsi="Arial"/>
-                <w:b w:val="0"/>
                 <w:i w:val="0"/>
                 <w:smallCaps w:val="0"/>
                 <w:strike w:val="0"/>
@@ -1233,7 +1140,6 @@
             <w:ind w:left="720" w:firstLine="0"/>
             <w:rPr>
               <w:rFonts w:ascii="Arial" w:cs="Arial" w:eastAsia="Arial" w:hAnsi="Arial"/>
-              <w:b w:val="0"/>
               <w:i w:val="0"/>
               <w:smallCaps w:val="0"/>
               <w:strike w:val="0"/>
@@ -1248,8 +1154,6 @@
           <w:hyperlink w:anchor="_heading=">
             <w:r>
               <w:rPr>
-                <w:rFonts w:ascii="Arial" w:cs="Arial" w:eastAsia="Arial" w:hAnsi="Arial"/>
-                <w:b w:val="0"/>
                 <w:i w:val="0"/>
                 <w:smallCaps w:val="0"/>
                 <w:strike w:val="0"/>
@@ -1282,7 +1186,6 @@
             <w:ind w:left="720" w:firstLine="0"/>
             <w:rPr>
               <w:rFonts w:ascii="Arial" w:cs="Arial" w:eastAsia="Arial" w:hAnsi="Arial"/>
-              <w:b w:val="0"/>
               <w:i w:val="0"/>
               <w:smallCaps w:val="0"/>
               <w:strike w:val="0"/>
@@ -1297,8 +1200,6 @@
           <w:hyperlink w:anchor="_heading=">
             <w:r>
               <w:rPr>
-                <w:rFonts w:ascii="Arial" w:cs="Arial" w:eastAsia="Arial" w:hAnsi="Arial"/>
-                <w:b w:val="0"/>
                 <w:i w:val="0"/>
                 <w:smallCaps w:val="0"/>
                 <w:strike w:val="0"/>
@@ -1331,11 +1232,10 @@
             <w:ind w:left="720" w:firstLine="0"/>
             <w:rPr>
               <w:rFonts w:ascii="Arial" w:cs="Arial" w:eastAsia="Arial" w:hAnsi="Arial"/>
-              <w:b w:val="0"/>
               <w:i w:val="0"/>
               <w:smallCaps w:val="0"/>
               <w:strike w:val="0"/>
-              <w:color w:val="000000"/>
+              <w:color w:val="2e7d32"/>
               <w:sz w:val="22"/>
               <w:szCs w:val="22"/>
               <w:u w:val="none"/>
@@ -1346,8 +1246,6 @@
           <w:hyperlink w:anchor="_heading=">
             <w:r>
               <w:rPr>
-                <w:rFonts w:ascii="Arial" w:cs="Arial" w:eastAsia="Arial" w:hAnsi="Arial"/>
-                <w:b w:val="0"/>
                 <w:i w:val="0"/>
                 <w:smallCaps w:val="0"/>
                 <w:strike w:val="0"/>
@@ -1360,24 +1258,6 @@
                 <w:rtl w:val="0"/>
               </w:rPr>
               <w:t xml:space="preserve">3.9 Felhasználók (course_members)</w:t>
-            </w:r>
-          </w:hyperlink>
-          <w:hyperlink w:anchor="_heading=">
-            <w:r>
-              <w:rPr>
-                <w:rFonts w:ascii="Arial" w:cs="Arial" w:eastAsia="Arial" w:hAnsi="Arial"/>
-                <w:b w:val="0"/>
-                <w:i w:val="0"/>
-                <w:smallCaps w:val="0"/>
-                <w:strike w:val="0"/>
-                <w:color w:val="000000"/>
-                <w:sz w:val="22"/>
-                <w:szCs w:val="22"/>
-                <w:u w:val="none"/>
-                <w:shd w:fill="auto" w:val="clear"/>
-                <w:vertAlign w:val="baseline"/>
-                <w:rtl w:val="0"/>
-              </w:rPr>
               <w:tab/>
               <w:t xml:space="preserve">7</w:t>
             </w:r>
@@ -1412,26 +1292,7 @@
           <w:hyperlink w:anchor="_heading=">
             <w:r>
               <w:rPr>
-                <w:rFonts w:ascii="Arial" w:cs="Arial" w:eastAsia="Arial" w:hAnsi="Arial"/>
-                <w:b w:val="1"/>
-                <w:i w:val="0"/>
-                <w:smallCaps w:val="0"/>
-                <w:strike w:val="0"/>
-                <w:color w:val="000000"/>
-                <w:sz w:val="22"/>
-                <w:szCs w:val="22"/>
-                <w:u w:val="none"/>
-                <w:shd w:fill="auto" w:val="clear"/>
-                <w:vertAlign w:val="baseline"/>
-                <w:rtl w:val="0"/>
-              </w:rPr>
-              <w:t xml:space="preserve">4.</w:t>
-            </w:r>
-          </w:hyperlink>
-          <w:hyperlink w:anchor="_heading=">
-            <w:r>
-              <w:rPr>
-                <w:rFonts w:ascii="Arial" w:cs="Arial" w:eastAsia="Arial" w:hAnsi="Arial"/>
+                <w:rFonts w:ascii="Cambria" w:cs="Cambria" w:eastAsia="Cambria" w:hAnsi="Cambria"/>
                 <w:b w:val="1"/>
                 <w:i w:val="0"/>
                 <w:smallCaps w:val="0"/>
@@ -1444,25 +1305,7 @@
                 <w:vertAlign w:val="baseline"/>
                 <w:rtl w:val="0"/>
               </w:rPr>
-              <w:t xml:space="preserve"> Adat Modell</w:t>
-            </w:r>
-          </w:hyperlink>
-          <w:hyperlink w:anchor="_heading=">
-            <w:r>
-              <w:rPr>
-                <w:rFonts w:ascii="Arial" w:cs="Arial" w:eastAsia="Arial" w:hAnsi="Arial"/>
-                <w:b w:val="1"/>
-                <w:i w:val="0"/>
-                <w:smallCaps w:val="0"/>
-                <w:strike w:val="0"/>
-                <w:color w:val="000000"/>
-                <w:sz w:val="22"/>
-                <w:szCs w:val="22"/>
-                <w:u w:val="none"/>
-                <w:shd w:fill="auto" w:val="clear"/>
-                <w:vertAlign w:val="baseline"/>
-                <w:rtl w:val="0"/>
-              </w:rPr>
+              <w:t xml:space="preserve">4. Adatmodell</w:t>
               <w:tab/>
               <w:t xml:space="preserve">8</w:t>
             </w:r>
@@ -6437,7 +6280,7 @@
       </w:r>
       <w:sdt>
         <w:sdtPr>
-          <w:id w:val="1052191656"/>
+          <w:id w:val="-1842669190"/>
           <w:tag w:val="goog_rdk_0"/>
         </w:sdtPr>
         <w:sdtContent>
@@ -6515,7 +6358,7 @@
       </w:r>
       <w:sdt>
         <w:sdtPr>
-          <w:id w:val="1333919230"/>
+          <w:id w:val="1205912813"/>
           <w:tag w:val="goog_rdk_1"/>
         </w:sdtPr>
         <w:sdtContent>
@@ -6918,15 +6761,39 @@
       <w:pPr>
         <w:spacing w:line="240" w:lineRule="auto"/>
         <w:ind w:right="-716"/>
-        <w:rPr>
-          <w:sz w:val="24"/>
-          <w:szCs w:val="24"/>
-        </w:rPr>
-      </w:pPr>
-      <w:r>
-        <w:rPr>
-          <w:rtl w:val="0"/>
-        </w:rPr>
+        <w:jc w:val="center"/>
+        <w:rPr>
+          <w:sz w:val="24"/>
+          <w:szCs w:val="24"/>
+        </w:rPr>
+      </w:pPr>
+      <w:r>
+        <w:rPr>
+          <w:sz w:val="24"/>
+          <w:szCs w:val="24"/>
+          <w:rtl w:val="0"/>
+        </w:rPr>
+        <w:t xml:space="preserve">Az illusztráció a </w:t>
+      </w:r>
+      <w:hyperlink r:id="rId9">
+        <w:r>
+          <w:rPr>
+            <w:color w:val="1155cc"/>
+            <w:sz w:val="24"/>
+            <w:szCs w:val="24"/>
+            <w:u w:val="single"/>
+            <w:rtl w:val="0"/>
+          </w:rPr>
+          <w:t xml:space="preserve">dbdiagram.com</w:t>
+        </w:r>
+      </w:hyperlink>
+      <w:r>
+        <w:rPr>
+          <w:sz w:val="24"/>
+          <w:szCs w:val="24"/>
+          <w:rtl w:val="0"/>
+        </w:rPr>
+        <w:t xml:space="preserve"> segítségével készült.</w:t>
       </w:r>
     </w:p>
     <w:p>
@@ -6956,7 +6823,7 @@
                     <pic:cNvPicPr preferRelativeResize="0"/>
                   </pic:nvPicPr>
                   <pic:blipFill>
-                    <a:blip r:embed="rId9"/>
+                    <a:blip r:embed="rId10"/>
                     <a:srcRect b="0" l="0" r="0" t="0"/>
                     <a:stretch>
                       <a:fillRect/>
@@ -6983,10 +6850,10 @@
       </w:r>
     </w:p>
     <w:sectPr>
-      <w:headerReference r:id="rId10" w:type="default"/>
-      <w:headerReference r:id="rId11" w:type="first"/>
-      <w:footerReference r:id="rId12" w:type="default"/>
-      <w:footerReference r:id="rId13" w:type="first"/>
+      <w:headerReference r:id="rId11" w:type="default"/>
+      <w:headerReference r:id="rId12" w:type="first"/>
+      <w:footerReference r:id="rId13" w:type="default"/>
+      <w:footerReference r:id="rId14" w:type="first"/>
       <w:pgSz w:h="15840" w:w="12240" w:orient="portrait"/>
       <w:pgMar w:bottom="1440" w:top="1440" w:left="1417" w:right="908" w:header="720" w:footer="720"/>
       <w:pgNumType w:start="0"/>
@@ -7083,7 +6950,7 @@
       </w:rPr>
       <w:pict>
         <v:shape id="WordPictureWatermark1" style="position:absolute;width:470.9pt;height:470.9pt;rotation:0;z-index:-503316481;mso-position-horizontal-relative:margin;mso-position-horizontal:center;mso-position-vertical-relative:margin;mso-position-vertical:center;" alt="" type="#_x0000_t75">
-          <v:imagedata blacklevel="22938f" cropbottom="0f" cropleft="0f" cropright="0f" croptop="0f" gain="19661f" r:id="rId1" o:title="image1.png"/>
+          <v:imagedata blacklevel="22938f" cropbottom="0f" cropleft="0f" cropright="0f" croptop="0f" gain="19661f" r:id="rId1" o:title="image2.png"/>
         </v:shape>
       </w:pict>
     </w:r>
@@ -7107,12 +6974,12 @@
           <wp:extent cx="1400288" cy="773640"/>
           <wp:effectExtent b="0" l="0" r="0" t="0"/>
           <wp:wrapNone/>
-          <wp:docPr id="19" name="image3.png"/>
+          <wp:docPr id="19" name="image5.png"/>
           <a:graphic>
             <a:graphicData uri="http://schemas.openxmlformats.org/drawingml/2006/picture">
               <pic:pic>
                 <pic:nvPicPr>
-                  <pic:cNvPr id="0" name="image3.png"/>
+                  <pic:cNvPr id="0" name="image5.png"/>
                   <pic:cNvPicPr preferRelativeResize="0"/>
                 </pic:nvPicPr>
                 <pic:blipFill>
@@ -7156,7 +7023,7 @@
       </w:rPr>
       <w:pict>
         <v:shape id="WordPictureWatermark2" style="position:absolute;width:470.9pt;height:470.9pt;rotation:0;z-index:-503316481;mso-position-horizontal-relative:margin;mso-position-horizontal:absolute;margin-left:-7.1pt;mso-position-vertical-relative:margin;mso-position-vertical:absolute;margin-top:78.09992125984252pt;" alt="" type="#_x0000_t75">
-          <v:imagedata blacklevel="22938f" cropbottom="0f" cropleft="0f" cropright="0f" croptop="0f" gain="19661f" r:id="rId1" o:title="image1.png"/>
+          <v:imagedata blacklevel="22938f" cropbottom="0f" cropleft="0f" cropright="0f" croptop="0f" gain="19661f" r:id="rId1" o:title="image2.png"/>
         </v:shape>
       </w:pict>
     </w:r>
@@ -7178,12 +7045,12 @@
           <wp:extent cx="3062605" cy="2581275"/>
           <wp:effectExtent b="0" l="0" r="0" t="0"/>
           <wp:wrapNone/>
-          <wp:docPr id="17" name="image2.png"/>
+          <wp:docPr id="17" name="image1.png"/>
           <a:graphic>
             <a:graphicData uri="http://schemas.openxmlformats.org/drawingml/2006/picture">
               <pic:pic>
                 <pic:nvPicPr>
-                  <pic:cNvPr id="0" name="image2.png"/>
+                  <pic:cNvPr id="0" name="image1.png"/>
                   <pic:cNvPicPr preferRelativeResize="0"/>
                 </pic:nvPicPr>
                 <pic:blipFill>

</xml_diff>